<commit_message>
docs: update GDD (drop in-run XP, add tutorial and analytics); fix Spiderscout sprites
GDD:
- remove section 3.5 (in-run XP/level-ups) to match the Brotato-style
  Wave -> Shop loop; replace XP/level-up mentions with coins/shop
- add 2.4 Tutorial (one-time joystick and shop hints)
- add 6.1 Analytics layer (IAnalytics + stub subscribed to GameEvents)
- add tutorial and analytics to MVP criteria

Art:
- fix Spiderscout idle/walk/death sprites and their import settings;
  update SpiderScoutDeath animation accordingly

Co-Authored-By: Claude Sonnet 5.5 <noreply@anthropic.com>
</commit_message>
<xml_diff>
--- a/Documentation~/GDD_Survivors_Like.docx
+++ b/Documentation~/GDD_Survivors_Like.docx
@@ -20,7 +20,7 @@
           <w:i/>
           <w:iCs/>
         </w:rPr>
-        <w:t xml:space="preserve">[Working Title] — Cyberpunk Survivors-like для Android</w:t>
+        <w:t xml:space="preserve">Swarm &amp; Shine — Survivors-like для Android</w:t>
       </w:r>
     </w:p>
     <w:p>
@@ -35,7 +35,7 @@
         <w:t xml:space="preserve">Версия документа: </w:t>
       </w:r>
       <w:r>
-        <w:t xml:space="preserve">1.3</w:t>
+        <w:t xml:space="preserve">1.6</w:t>
       </w:r>
     </w:p>
     <w:p>
@@ -95,7 +95,7 @@
         <w:t xml:space="preserve">Сеттинг: </w:t>
       </w:r>
       <w:r>
-        <w:t xml:space="preserve">Киберпанк, крыши мегаполиса</w:t>
+        <w:t xml:space="preserve">Выжженная солнцем песчаная пустыня на окраине мегаполиса, среди монументальных ржавых остовов боевых машин</w:t>
       </w:r>
     </w:p>
     <w:p>
@@ -166,7 +166,7 @@
         <w:spacing w:after="120"/>
       </w:pPr>
       <w:r>
-        <w:t xml:space="preserve">Игрок управляет персонажем на статичной 2D-арене, автоматически атакующим приближающихся врагов. Волны противников нарастают по сложности, игрок собирает опыт и выбирает апгрейды между уровнями. Забег длится 8-12 минут и заканчивается смертью или выживанием до таймера. Между забегами — постоянная мета-прогрессия за накопленную валюту.</w:t>
+        <w:t xml:space="preserve">Игрок управляет персонажем на статичной 2D-арене, автоматически атакующим приближающихся врагов. Волны противников нарастают по сложности, игрок собирает монеты и тратит их в магазине между волнами. Забег длится 8-12 минут и заканчивается смертью или выживанием до таймера. Между забегами — постоянная мета-прогрессия за накопленную валюту.</w:t>
       </w:r>
     </w:p>
     <w:p>
@@ -253,7 +253,7 @@
         <w:spacing w:after="120"/>
       </w:pPr>
       <w:r>
-        <w:t xml:space="preserve">Мегаполис после корпоративной «тихой войны» за контроль над сетью. Улицы — территория корпоративной охраны и её ИИ, поэтому все нелегальные разборки — курьеры, хакеры, беглые ИИ — идут по крышам, соединённым тросами и вентшахтами.</w:t>
+        <w:t xml:space="preserve">Мегаполис после корпоративной «тихой войны» за контроль над сетью — но не сама война уничтожила город, а вышедшие из-под контроля боевые дроны и автономные машины, брошенные после её окончания. Их монументальные ржавые остовы теперь торчат из раскалённых солнцем песков на пустырях и промзонах за периметром города — токсичная и опасная территория, куда не суётся даже корпоративная охрана, и поэтому именно там теперь идут все нелегальные разборки — курьеры, хакеры, беглые ИИ.</w:t>
       </w:r>
     </w:p>
     <w:p>
@@ -261,7 +261,7 @@
         <w:spacing w:after="120"/>
       </w:pPr>
       <w:r>
-        <w:t xml:space="preserve">Герой — раннер, который тащит на себе краденый дата-чип и отбивается волнами преследователей до эвакуации. Эвакуационный дрон/вертолёт в конце забега — это нарративная рамка под «выживание до таймера»: рамка одинаково хорошо объясняет и статичную арену (крыша замкнута), и структуру Wave → Shop → Wave (передышка между волнами — пока раннер пробирается к следующей точке на крыше).</w:t>
+        <w:t xml:space="preserve">Герой — раннер, который тащит на себе краденый дата-чип и отбивается волнами преследователей до эвакуации. Эвакуационный дрон/вертолёт в конце забега — это нарративная рамка под «выживание до таймера»: рамка одинаково хорошо объясняет и статичную арену (пустырь окружён завалами и непроходим для наземного транспорта, кроме воздушного), и структуру Wave → Shop → Wave (передышка между волнами — пока раннер пробирается через обломки к следующей открытой точке пустыря).</w:t>
       </w:r>
     </w:p>
     <w:p>
@@ -538,7 +538,7 @@
         <w:spacing w:after="80"/>
       </w:pPr>
       <w:r>
-        <w:t xml:space="preserve">Главное меню → магазин постоянных апгрейдов (урон, HP, скорость сбора опыта и т.д.).</w:t>
+        <w:t xml:space="preserve">Главное меню → магазин постоянных апгрейдов (урон, HP, радиус подбора монет и т.д.).</w:t>
       </w:r>
     </w:p>
     <w:p>
@@ -618,6 +618,88 @@
       </w:pPr>
       <w:r>
         <w:t xml:space="preserve">Атака, прицеливание — не требуют инпута игрока.</w:t>
+      </w:r>
+    </w:p>
+    <w:p>
+      <w:pPr>
+        <w:spacing w:after="100"/>
+      </w:pPr>
+    </w:p>
+    <w:p>
+      <w:pPr>
+        <w:pStyle w:val="Heading2"/>
+        <w:spacing w:after="120" w:before="250"/>
+      </w:pPr>
+      <w:r>
+        <w:t xml:space="preserve">2.4 Туториал</w:t>
+      </w:r>
+    </w:p>
+    <w:p>
+      <w:pPr>
+        <w:spacing w:after="120"/>
+      </w:pPr>
+      <w:r>
+        <w:t xml:space="preserve">Джойстик и магазин (реролл/lock, см. 3.1a) — два элемента управления, не считываемые интуитивно с первого взгляда. Задача туториала — не обучающий уровень, а 1-2 точечные подсказки именно в первом забеге новичка, без отдельного экрана или паузы на объяснения.</w:t>
+      </w:r>
+    </w:p>
+    <w:p>
+      <w:pPr>
+        <w:pStyle w:val="ListParagraph"/>
+        <w:numPr>
+          <w:ilvl w:val="0"/>
+          <w:numId w:val="2"/>
+        </w:numPr>
+        <w:spacing w:after="80"/>
+      </w:pPr>
+      <w:r>
+        <w:rPr>
+          <w:b/>
+          <w:bCs/>
+        </w:rPr>
+        <w:t xml:space="preserve">Подсказка 1 — джойстик: </w:t>
+      </w:r>
+      <w:r>
+        <w:t xml:space="preserve">полупрозрачная подпись/стрелка на зоне джойстика при самом первом появлении на арене, исчезает после первого касания. Показывается один раз за весь жизненный цикл приложения (флаг в сохранении), не повторяется в последующих забегах.</w:t>
+      </w:r>
+    </w:p>
+    <w:p>
+      <w:pPr>
+        <w:pStyle w:val="ListParagraph"/>
+        <w:numPr>
+          <w:ilvl w:val="0"/>
+          <w:numId w:val="2"/>
+        </w:numPr>
+        <w:spacing w:after="80"/>
+      </w:pPr>
+      <w:r>
+        <w:rPr>
+          <w:b/>
+          <w:bCs/>
+        </w:rPr>
+        <w:t xml:space="preserve">Подсказка 2 — магазин: </w:t>
+      </w:r>
+      <w:r>
+        <w:t xml:space="preserve">при первом открытии экрана магазина — короткая подсветка/стрелка на кнопках Reroll и Lock с одной строкой текста каждая («Реролл — новый набор за монеты», «Lock — зафиксировать слот»). Также одноразово, тот же флаг-подход.</w:t>
+      </w:r>
+    </w:p>
+    <w:p>
+      <w:pPr>
+        <w:pStyle w:val="ListParagraph"/>
+        <w:numPr>
+          <w:ilvl w:val="0"/>
+          <w:numId w:val="2"/>
+        </w:numPr>
+        <w:spacing w:after="80"/>
+      </w:pPr>
+      <w:r>
+        <w:rPr>
+          <w:b/>
+          <w:bCs/>
+        </w:rPr>
+        <w:t xml:space="preserve">Технически: </w:t>
+      </w:r>
+      <w:r>
+        <w:t xml:space="preserve">пара bool-флагов в сохранении (seenJoystickHint, seenShopHint), проверяются при входе в соответствующий экран — без отдельной системы туториалов или сценарного скриптинга, минимальный объём на неделе 2 вместе с UI магазина.</w:t>
       </w:r>
     </w:p>
     <w:p>
@@ -1706,7 +1788,7 @@
                 <w:b w:val="false"/>
                 <w:bCs w:val="false"/>
               </w:rPr>
-              <w:t xml:space="preserve">Кибер-пёс</w:t>
+              <w:t xml:space="preserve">Песчаная гусеница</w:t>
             </w:r>
           </w:p>
         </w:tc>
@@ -1726,7 +1808,7 @@
                 <w:b w:val="false"/>
                 <w:bCs w:val="false"/>
               </w:rPr>
-              <w:t xml:space="preserve">Быстрый, низкое HP, стаями</w:t>
+              <w:t xml:space="preserve">Быстрый, низкое HP, движется посегментным сжатием-растяжением, стаями</w:t>
             </w:r>
           </w:p>
         </w:tc>
@@ -1830,7 +1912,7 @@
                 <w:b w:val="false"/>
                 <w:bCs w:val="false"/>
               </w:rPr>
-              <w:t xml:space="preserve">Щитовик корпо-полиции</w:t>
+              <w:t xml:space="preserve">Боевой дроид</w:t>
             </w:r>
           </w:p>
         </w:tc>
@@ -1850,7 +1932,7 @@
                 <w:b w:val="false"/>
                 <w:bCs w:val="false"/>
               </w:rPr>
-              <w:t xml:space="preserve">Медленный, высокое HP/броня</w:t>
+              <w:t xml:space="preserve">Медленный, высокое HP/броня, читаемый щит на корпусе</w:t>
             </w:r>
           </w:p>
         </w:tc>
@@ -1895,10 +1977,10 @@
           <w:b/>
           <w:bCs/>
         </w:rPr>
-        <w:t xml:space="preserve">Мини-босс — Экзоскелет-энфорсер: </w:t>
-      </w:r>
-      <w:r>
-        <w:t xml:space="preserve">медленный, телеграфируемые AoE-удары, вторая фаза — ускоряется. Появляется в конце забега.</w:t>
+        <w:t xml:space="preserve">Мини-босс — осадный мех «Голиаф»: </w:t>
+      </w:r>
+      <w:r>
+        <w:t xml:space="preserve">медленный, телеграфируемые AoE-удары, вторая фаза — ракетные блоки раскрываются/подсвечиваются и мех ускоряется. Появляется в конце забега.</w:t>
       </w:r>
     </w:p>
     <w:p>
@@ -1925,47 +2007,7 @@
         <w:spacing w:after="120" w:before="250"/>
       </w:pPr>
       <w:r>
-        <w:t xml:space="preserve">3.5 Прогрессия внутри забега</w:t>
-      </w:r>
-    </w:p>
-    <w:p>
-      <w:pPr>
-        <w:pStyle w:val="ListParagraph"/>
-        <w:numPr>
-          <w:ilvl w:val="0"/>
-          <w:numId w:val="2"/>
-        </w:numPr>
-        <w:spacing w:after="80"/>
-      </w:pPr>
-      <w:r>
-        <w:t xml:space="preserve">Кривая опыта: экспоненциальный рост требуемого опыта на левелап.</w:t>
-      </w:r>
-    </w:p>
-    <w:p>
-      <w:pPr>
-        <w:pStyle w:val="ListParagraph"/>
-        <w:numPr>
-          <w:ilvl w:val="0"/>
-          <w:numId w:val="2"/>
-        </w:numPr>
-        <w:spacing w:after="80"/>
-      </w:pPr>
-      <w:r>
-        <w:t xml:space="preserve">Целевое количество левелапов за забег: 15-20 (даёт частые decision points).</w:t>
-      </w:r>
-    </w:p>
-    <w:p>
-      <w:pPr>
-        <w:spacing w:after="100"/>
-      </w:pPr>
-    </w:p>
-    <w:p>
-      <w:pPr>
-        <w:pStyle w:val="Heading2"/>
-        <w:spacing w:after="120" w:before="250"/>
-      </w:pPr>
-      <w:r>
-        <w:t xml:space="preserve">3.6 Мета-прогрессия и магазин в главном меню</w:t>
+        <w:t xml:space="preserve">3.5 Мета-прогрессия и магазин в главном меню</w:t>
       </w:r>
     </w:p>
     <w:p>
@@ -2213,20 +2255,20 @@
         <w:spacing w:after="80"/>
       </w:pPr>
       <w:r>
-        <w:t xml:space="preserve">2D top-down (вид строго сверху, НЕ изометрия), крыши мегаполиса.</w:t>
-      </w:r>
-    </w:p>
-    <w:p>
-      <w:pPr>
-        <w:pStyle w:val="ListParagraph"/>
-        <w:numPr>
-          <w:ilvl w:val="0"/>
-          <w:numId w:val="2"/>
-        </w:numPr>
-        <w:spacing w:after="80"/>
-      </w:pPr>
-      <w:r>
-        <w:t xml:space="preserve">Тёмно-синий/фиолетовый фон крыш с 2-3 неоновыми акцентами (циан, маджента, жёлтый) — количество акцентных цветов ограничено намеренно, иначе на маленьком экране всё сольётся.</w:t>
+        <w:t xml:space="preserve">2D top-down (вид строго сверху, НЕ изометрия), раскалённая солнцем песчаная пустыня на окраине мегаполиса с монументальными ржавыми остовами боевых машин, вросшими в барханы.</w:t>
+      </w:r>
+    </w:p>
+    <w:p>
+      <w:pPr>
+        <w:pStyle w:val="ListParagraph"/>
+        <w:numPr>
+          <w:ilvl w:val="0"/>
+          <w:numId w:val="2"/>
+        </w:numPr>
+        <w:spacing w:after="80"/>
+      </w:pPr>
+      <w:r>
+        <w:t xml:space="preserve">Тёплая песочно-охристая база земли/обломков, без неоновых акцентов. Каждый тип врага получает свой узнаваемый цвет тела/материала — это свойство конкретного юнита, а не код команды/фракции.</w:t>
       </w:r>
     </w:p>
     <w:p>
@@ -2246,27 +2288,7 @@
         <w:t xml:space="preserve">Правило силуэта: </w:t>
       </w:r>
       <w:r>
-        <w:t xml:space="preserve">каждый тип врага должен читаться по силуэту без цвета — это дешёвый способ гарантировать читаемость при 150+ врагах на экране, не тратя время на лишнюю детализацию.</w:t>
-      </w:r>
-    </w:p>
-    <w:p>
-      <w:pPr>
-        <w:pStyle w:val="ListParagraph"/>
-        <w:numPr>
-          <w:ilvl w:val="0"/>
-          <w:numId w:val="2"/>
-        </w:numPr>
-        <w:spacing w:after="80"/>
-      </w:pPr>
-      <w:r>
-        <w:rPr>
-          <w:b/>
-          <w:bCs/>
-        </w:rPr>
-        <w:t xml:space="preserve">Рим-лайт вместо детализации: </w:t>
-      </w:r>
-      <w:r>
-        <w:t xml:space="preserve">неоновая обводка по контуру спрайта даёт ощущение «технологичности» почти бесплатно и маскирует швы между AI-генерированными кадрами анимации.</w:t>
+        <w:t xml:space="preserve">единственный механизм различимости врагов — каждый тип должен читаться по силуэту без цвета. Это дешёвый способ гарантировать читаемость при 150+ врагах на экране, не тратя время на лишнюю детализацию и без каких-либо обводок/подсветок поверх спрайта.</w:t>
       </w:r>
     </w:p>
     <w:p>
@@ -2306,20 +2328,20 @@
         <w:spacing w:after="80"/>
       </w:pPr>
       <w:r>
-        <w:t xml:space="preserve">Фон: тайлящаяся текстура кровли/гравия с редкими неоновыми вывесками на заднем плане, статичный или с лёгким parallax (parallax не обязателен для MVP).</w:t>
-      </w:r>
-    </w:p>
-    <w:p>
-      <w:pPr>
-        <w:pStyle w:val="ListParagraph"/>
-        <w:numPr>
-          <w:ilvl w:val="0"/>
-          <w:numId w:val="2"/>
-        </w:numPr>
-        <w:spacing w:after="80"/>
-      </w:pPr>
-      <w:r>
-        <w:t xml:space="preserve">UI: отдельный набор иконок под оружие/апгрейды (согласованный неоновый стиль для читаемости на экране выбора).</w:t>
+        <w:t xml:space="preserve">Фон: тайлящаяся текстура песчаной пустыни с вросшими ржавыми остовами боевых машин на заднем плане, статичный или с лёгким parallax (parallax не обязателен для MVP).</w:t>
+      </w:r>
+    </w:p>
+    <w:p>
+      <w:pPr>
+        <w:pStyle w:val="ListParagraph"/>
+        <w:numPr>
+          <w:ilvl w:val="0"/>
+          <w:numId w:val="2"/>
+        </w:numPr>
+        <w:spacing w:after="80"/>
+      </w:pPr>
+      <w:r>
+        <w:t xml:space="preserve">UI: отдельный набор иконок под оружие/апгрейды (согласованный тёплый стиль для читаемости на экране выбора).</w:t>
       </w:r>
     </w:p>
     <w:p>
@@ -2346,7 +2368,7 @@
         <w:spacing w:after="80"/>
       </w:pPr>
       <w:r>
-        <w:t xml:space="preserve">Хиты, смерти врагов, левелап — простые партиклы/спрайт-анимации.</w:t>
+        <w:t xml:space="preserve">Хиты, смерти врагов, подбор монет — простые партиклы/спрайт-анимации.</w:t>
       </w:r>
     </w:p>
     <w:p>
@@ -3081,6 +3103,68 @@
           </w:p>
         </w:tc>
       </w:tr>
+      <w:tr>
+        <w:tc>
+          <w:tcPr>
+            <w:tcW w:type="dxa" w:w="1900"/>
+            <w:tcMar>
+              <w:top w:type="dxa" w:w="80"/>
+              <w:left w:type="dxa" w:w="100"/>
+              <w:bottom w:type="dxa" w:w="80"/>
+              <w:right w:type="dxa" w:w="100"/>
+            </w:tcMar>
+          </w:tcPr>
+          <w:p>
+            <w:r>
+              <w:rPr>
+                <w:b w:val="false"/>
+                <w:bCs w:val="false"/>
+              </w:rPr>
+              <w:t xml:space="preserve">Analytics Layer</w:t>
+            </w:r>
+          </w:p>
+        </w:tc>
+        <w:tc>
+          <w:tcPr>
+            <w:tcW w:type="dxa" w:w="4300"/>
+            <w:tcMar>
+              <w:top w:type="dxa" w:w="80"/>
+              <w:left w:type="dxa" w:w="100"/>
+              <w:bottom w:type="dxa" w:w="80"/>
+              <w:right w:type="dxa" w:w="100"/>
+            </w:tcMar>
+          </w:tcPr>
+          <w:p>
+            <w:r>
+              <w:rPr>
+                <w:b w:val="false"/>
+                <w:bCs w:val="false"/>
+              </w:rPr>
+              <w:t xml:space="preserve">Интерфейс IAnalytics + заглушка-реализация (StubAnalytics, пишет в лог), подписана на события GameEvents</w:t>
+            </w:r>
+          </w:p>
+        </w:tc>
+        <w:tc>
+          <w:tcPr>
+            <w:tcW w:type="dxa" w:w="3400"/>
+            <w:tcMar>
+              <w:top w:type="dxa" w:w="80"/>
+              <w:left w:type="dxa" w:w="100"/>
+              <w:bottom w:type="dxa" w:w="80"/>
+              <w:right w:type="dxa" w:w="100"/>
+            </w:tcMar>
+          </w:tcPr>
+          <w:p>
+            <w:r>
+              <w:rPr>
+                <w:b w:val="false"/>
+                <w:bCs w:val="false"/>
+              </w:rPr>
+              <w:t xml:space="preserve">Демонстрация архитектурной готовности к аналитике без интеграции реального SDK</w:t>
+            </w:r>
+          </w:p>
+        </w:tc>
+      </w:tr>
     </w:tbl>
     <w:p>
       <w:pPr>
@@ -3093,46 +3177,55 @@
         <w:spacing w:after="120" w:before="250"/>
       </w:pPr>
       <w:r>
-        <w:t xml:space="preserve">6.1 Заметки по производительности</w:t>
-      </w:r>
-    </w:p>
-    <w:p>
-      <w:pPr>
-        <w:pStyle w:val="ListParagraph"/>
-        <w:numPr>
-          <w:ilvl w:val="0"/>
-          <w:numId w:val="2"/>
-        </w:numPr>
-        <w:spacing w:after="80"/>
-      </w:pPr>
-      <w:r>
-        <w:t xml:space="preserve">Пулинг обязателен с первой недели разработки — переделка архитектуры под пулинг постфактум дорога.</w:t>
-      </w:r>
-    </w:p>
-    <w:p>
-      <w:pPr>
-        <w:pStyle w:val="ListParagraph"/>
-        <w:numPr>
-          <w:ilvl w:val="0"/>
-          <w:numId w:val="2"/>
-        </w:numPr>
-        <w:spacing w:after="80"/>
-      </w:pPr>
-      <w:r>
-        <w:t xml:space="preserve">Ограничение одновременных снарядов/врагов на экране (тестировать на слабых устройствах, например, ~2-3 года давности бюджетный Android).</w:t>
-      </w:r>
-    </w:p>
-    <w:p>
-      <w:pPr>
-        <w:pStyle w:val="ListParagraph"/>
-        <w:numPr>
-          <w:ilvl w:val="0"/>
-          <w:numId w:val="2"/>
-        </w:numPr>
-        <w:spacing w:after="80"/>
-      </w:pPr>
-      <w:r>
-        <w:t xml:space="preserve">Избегать Update() на каждом враге по отдельности при большом их количестве — рассмотреть батчинг через центральный менеджер, если враги превысят ~150-200 одновременно.</w:t>
+        <w:t xml:space="preserve">6.1 Слой аналитики (IAnalytics)</w:t>
+      </w:r>
+    </w:p>
+    <w:p>
+      <w:pPr>
+        <w:spacing w:after="120"/>
+      </w:pPr>
+      <w:r>
+        <w:t xml:space="preserve">Для портфолио важна не реальная аналитика, а то, что архитектура к ней готова и это видно в коде. Один интерфейс IAnalytics (методы вроде TrackEvent(string eventName, Dictionary&lt;string, object&gt; parameters)) с единственной реализацией-заглушкой на MVP — StubAnalytics, которая просто логирует вызовы в консоль.</w:t>
+      </w:r>
+    </w:p>
+    <w:p>
+      <w:pPr>
+        <w:pStyle w:val="ListParagraph"/>
+        <w:numPr>
+          <w:ilvl w:val="0"/>
+          <w:numId w:val="2"/>
+        </w:numPr>
+        <w:spacing w:after="80"/>
+      </w:pPr>
+      <w:r>
+        <w:rPr>
+          <w:b/>
+          <w:bCs/>
+        </w:rPr>
+        <w:t xml:space="preserve">Подписка через Event Bus: </w:t>
+      </w:r>
+      <w:r>
+        <w:t xml:space="preserve">StubAnalytics подписывается на существующие события GameEvents (конец волны, смерть игрока, покупка в магазине, Extraction) — не требует отдельных вызовов трекинга внутри игровой логики, весь трекинг собирается в одном месте.</w:t>
+      </w:r>
+    </w:p>
+    <w:p>
+      <w:pPr>
+        <w:pStyle w:val="ListParagraph"/>
+        <w:numPr>
+          <w:ilvl w:val="0"/>
+          <w:numId w:val="2"/>
+        </w:numPr>
+        <w:spacing w:after="80"/>
+      </w:pPr>
+      <w:r>
+        <w:rPr>
+          <w:b/>
+          <w:bCs/>
+        </w:rPr>
+        <w:t xml:space="preserve">На собеседовании объясняется одной фразой: </w:t>
+      </w:r>
+      <w:r>
+        <w:t xml:space="preserve">«слой аналитики отделён интерфейсом от конкретного SDK и слушает те же события, что и остальная игра — подключить Firebase/Amplitude позже означает написать новую реализацию IAnalytics, не трогая игровой код».</w:t>
       </w:r>
     </w:p>
     <w:p>
@@ -3146,7 +3239,60 @@
         <w:spacing w:after="120" w:before="250"/>
       </w:pPr>
       <w:r>
-        <w:t xml:space="preserve">6.2 Граничные случаи</w:t>
+        <w:t xml:space="preserve">6.2 Заметки по производительности</w:t>
+      </w:r>
+    </w:p>
+    <w:p>
+      <w:pPr>
+        <w:pStyle w:val="ListParagraph"/>
+        <w:numPr>
+          <w:ilvl w:val="0"/>
+          <w:numId w:val="2"/>
+        </w:numPr>
+        <w:spacing w:after="80"/>
+      </w:pPr>
+      <w:r>
+        <w:t xml:space="preserve">Пулинг обязателен с первой недели разработки — переделка архитектуры под пулинг постфактум дорога.</w:t>
+      </w:r>
+    </w:p>
+    <w:p>
+      <w:pPr>
+        <w:pStyle w:val="ListParagraph"/>
+        <w:numPr>
+          <w:ilvl w:val="0"/>
+          <w:numId w:val="2"/>
+        </w:numPr>
+        <w:spacing w:after="80"/>
+      </w:pPr>
+      <w:r>
+        <w:t xml:space="preserve">Ограничение одновременных снарядов/врагов на экране (тестировать на слабых устройствах, например, ~2-3 года давности бюджетный Android).</w:t>
+      </w:r>
+    </w:p>
+    <w:p>
+      <w:pPr>
+        <w:pStyle w:val="ListParagraph"/>
+        <w:numPr>
+          <w:ilvl w:val="0"/>
+          <w:numId w:val="2"/>
+        </w:numPr>
+        <w:spacing w:after="80"/>
+      </w:pPr>
+      <w:r>
+        <w:t xml:space="preserve">Избегать Update() на каждом враге по отдельности при большом их количестве — рассмотреть батчинг через центральный менеджер, если враги превысят ~150-200 одновременно.</w:t>
+      </w:r>
+    </w:p>
+    <w:p>
+      <w:pPr>
+        <w:spacing w:after="100"/>
+      </w:pPr>
+    </w:p>
+    <w:p>
+      <w:pPr>
+        <w:pStyle w:val="Heading2"/>
+        <w:spacing w:after="120" w:before="250"/>
+      </w:pPr>
+      <w:r>
+        <w:t xml:space="preserve">6.3 Граничные случаи</w:t>
       </w:r>
     </w:p>
     <w:p>
@@ -3172,7 +3318,7 @@
         <w:spacing w:after="80"/>
       </w:pPr>
       <w:r>
-        <w:t xml:space="preserve">Экран выбора апгрейда не должен предлагать апгрейд для оружия, которого нет в свободных слотах, если все слоты заняты (только апгрейд существующего).</w:t>
+        <w:t xml:space="preserve">Магазин не должен предлагать новое оружие, если все 6 слотов заняты и такого типа среди них нет (допустим только дубликат уже имеющегося — он усиливает существующее, см. 3.2).</w:t>
       </w:r>
     </w:p>
     <w:p>
@@ -3357,7 +3503,7 @@
                 <w:b w:val="false"/>
                 <w:bCs w:val="false"/>
               </w:rPr>
-              <w:t xml:space="preserve">Система волн/спавна, 3-4 типа врагов, опыт/левелап, экран выбора апгрейдов (3-4 апгрейда)</w:t>
+              <w:t xml:space="preserve">Система волн/спавна, 3-4 типа врагов, дроп монет, внутриигровой магазин (4 слота, реролл, lock)</w:t>
             </w:r>
           </w:p>
         </w:tc>
@@ -3947,6 +4093,22 @@
       </w:pPr>
       <w:r>
         <w:t xml:space="preserve">☐  Опубликованная страница в Google Play (даже в закрытом тестировании)</w:t>
+      </w:r>
+    </w:p>
+    <w:p>
+      <w:pPr>
+        <w:spacing w:after="100"/>
+      </w:pPr>
+      <w:r>
+        <w:t xml:space="preserve">☐  Туториал-подсказки джойстика и магазина показаны новичку в первом забеге (см. 2.4)</w:t>
+      </w:r>
+    </w:p>
+    <w:p>
+      <w:pPr>
+        <w:spacing w:after="100"/>
+      </w:pPr>
+      <w:r>
+        <w:t xml:space="preserve">☐  IAnalytics + заглушка подписаны на GameEvents (см. 6.1)</w:t>
       </w:r>
     </w:p>
     <w:sectPr>

</xml_diff>

<commit_message>
docs: update GDD (weapon selling, duplicates), art brief and animation table
Co-Authored-By: Claude Sonnet 5.5 <noreply@anthropic.com>
</commit_message>
<xml_diff>
--- a/Documentation~/GDD_Survivors_Like.docx
+++ b/Documentation~/GDD_Survivors_Like.docx
@@ -35,7 +35,7 @@
         <w:t xml:space="preserve">Версия документа: </w:t>
       </w:r>
       <w:r>
-        <w:t xml:space="preserve">1.6</w:t>
+        <w:t xml:space="preserve">1.7</w:t>
       </w:r>
     </w:p>
     <w:p>
@@ -1277,6 +1277,19 @@
     </w:p>
     <w:p>
       <w:pPr>
+        <w:pStyle w:val="ListParagraph"/>
+        <w:numPr>
+          <w:ilvl w:val="0"/>
+          <w:numId w:val="2"/>
+        </w:numPr>
+        <w:spacing w:after="80"/>
+      </w:pPr>
+      <w:r>
+        <w:t xml:space="preserve">Продажа оружия — игрок может продать любое оружие из своих слотов (включая дубликаты и стартовое) и получить часть его цены (подробности — в 3.2). Продажа доступна в магазине между волнами; возможность продавать из меню паузы во время волны — в планах. Освободившийся слот можно сразу занять новой покупкой.</w:t>
+      </w:r>
+    </w:p>
+    <w:p>
+      <w:pPr>
         <w:spacing w:after="100"/>
       </w:pPr>
     </w:p>
@@ -1299,7 +1312,7 @@
         <w:spacing w:after="80"/>
       </w:pPr>
       <w:r>
-        <w:t xml:space="preserve">6-8 уникальных типов оружия на MVP.</w:t>
+        <w:t xml:space="preserve">5-8 уникальных типов оружия на MVP.</w:t>
       </w:r>
     </w:p>
     <w:p>
@@ -1338,7 +1351,7 @@
         <w:spacing w:after="80"/>
       </w:pPr>
       <w:r>
-        <w:t xml:space="preserve">Примеры типов: смарт-пистолет по ближайшему врагу (Ranged), орбитальный дрон-лезвие вокруг персонажа (Melee), EMP-пульс по площади (Ranged/AoE), возвращающийся диск-сюрикен (Melee).</w:t>
+        <w:t xml:space="preserve">Примеры типов: смарт-пистолет по ближайшему врагу (Ranged), дробовик — веер дроби по ближайшему врагу (Ranged), возвращающийся диск-сюрикен (Melee).</w:t>
       </w:r>
     </w:p>
     <w:p>
@@ -1364,7 +1377,20 @@
         <w:spacing w:after="80"/>
       </w:pPr>
       <w:r>
-        <w:t xml:space="preserve">Дубликат оружия в магазине, если слот уже занят тем же типом — усиливает существующий экземпляр (доп. урон/скорость), а не занимает новый слот.</w:t>
+        <w:t xml:space="preserve">Дубликаты разрешены: одно и то же оружие можно купить несколько раз, каждая копия занимает отдельный слот (из 6) и атакует независимо — игрок может «обвеситься» одним типом. Слияния и индивидуальной прокачки копий нет, усиление идёт только через статы (см. 3.3).</w:t>
+      </w:r>
+    </w:p>
+    <w:p>
+      <w:pPr>
+        <w:pStyle w:val="ListParagraph"/>
+        <w:numPr>
+          <w:ilvl w:val="0"/>
+          <w:numId w:val="2"/>
+        </w:numPr>
+        <w:spacing w:after="80"/>
+      </w:pPr>
+      <w:r>
+        <w:t xml:space="preserve">Продажа: оружие можно продать, освободив слот. Цена продажи = базовая цена оружия (поле ScriptableObject оружия) × коэффициент продажи (по умолчанию 50%, настраивается в конфиге магазина), округление вниз. Подтверждения продажи нет. Каждая копия продаётся отдельно; продать можно и последнее оружие.</w:t>
       </w:r>
     </w:p>
     <w:p>
@@ -3283,6 +3309,19 @@
     </w:p>
     <w:p>
       <w:pPr>
+        <w:pStyle w:val="ListParagraph"/>
+        <w:numPr>
+          <w:ilvl w:val="0"/>
+          <w:numId w:val="2"/>
+        </w:numPr>
+        <w:spacing w:after="80"/>
+      </w:pPr>
+      <w:r>
+        <w:t xml:space="preserve">Дубликаты оружия (см. 3.2) множат нагрузку: 6 копий одного ranged-оружия или нескольких дронов-питомцев — худший случай по числу снарядов/эффектов. Проверять именно этот сценарий на слабом устройстве.</w:t>
+      </w:r>
+    </w:p>
+    <w:p>
+      <w:pPr>
         <w:spacing w:after="100"/>
       </w:pPr>
     </w:p>
@@ -3318,7 +3357,7 @@
         <w:spacing w:after="80"/>
       </w:pPr>
       <w:r>
-        <w:t xml:space="preserve">Магазин не должен предлагать новое оружие, если все 6 слотов заняты и такого типа среди них нет (допустим только дубликат уже имеющегося — он усиливает существующее, см. 3.2).</w:t>
+        <w:t xml:space="preserve">Если все 6 слотов заняты, магазин по-прежнему предлагает оружие (включая дубликаты), но купить его нельзя, пока не освобождён слот. Так игрок может увидеть интересное оружие, продать одно из своих (см. 3.2) и купить нужное; кнопка покупки в этом случае недоступна, а цена не списывается.</w:t>
       </w:r>
     </w:p>
     <w:p>
@@ -4044,7 +4083,7 @@
         <w:spacing w:after="100"/>
       </w:pPr>
       <w:r>
-        <w:t xml:space="preserve">☐  1 стартовый персонаж (Ронин) + 2 разблокируемых (Люси, Монтер), 6-8 оружий, 6-8 пассивных апгрейдов</w:t>
+        <w:t xml:space="preserve">☐  1 стартовый персонаж (Ронин) + 2 разблокируемых (Люси, Монтер), 5-8 оружий, 6-8 пассивных апгрейдов</w:t>
       </w:r>
     </w:p>
     <w:p>

</xml_diff>